<commit_message>
added images of the light arrangements on the rover and mariner
</commit_message>
<xml_diff>
--- a/Lighting.docx
+++ b/Lighting.docx
@@ -3,6 +3,44 @@
 <w:document xmlns:wpc="http://schemas.microsoft.com/office/word/2010/wordprocessingCanvas" xmlns:mc="http://schemas.openxmlformats.org/markup-compatibility/2006" xmlns:o="urn:schemas-microsoft-com:office:office" xmlns:r="http://schemas.openxmlformats.org/officeDocument/2006/relationships" xmlns:m="http://schemas.openxmlformats.org/officeDocument/2006/math" xmlns:v="urn:schemas-microsoft-com:vml" xmlns:wp14="http://schemas.microsoft.com/office/word/2010/wordprocessingDrawing" xmlns:wp="http://schemas.openxmlformats.org/drawingml/2006/wordprocessingDrawing" xmlns:w10="urn:schemas-microsoft-com:office:word" xmlns:w="http://schemas.openxmlformats.org/wordprocessingml/2006/main" xmlns:w14="http://schemas.microsoft.com/office/word/2010/wordml" xmlns:wpg="http://schemas.microsoft.com/office/word/2010/wordprocessingGroup" xmlns:wpi="http://schemas.microsoft.com/office/word/2010/wordprocessingInk" xmlns:wne="http://schemas.microsoft.com/office/word/2006/wordml" xmlns:wps="http://schemas.microsoft.com/office/word/2010/wordprocessingShape" mc:Ignorable="w14 wp14">
   <w:body>
     <w:p>
+      <w:r>
+        <w:fldChar w:fldCharType="begin"/>
+      </w:r>
+      <w:r>
+        <w:instrText xml:space="preserve"> HYPERLINK "http://www.thefountainguys.com/underwater-lights.htm" </w:instrText>
+      </w:r>
+      <w:r>
+        <w:fldChar w:fldCharType="separate"/>
+      </w:r>
+      <w:r>
+        <w:rPr>
+          <w:rStyle w:val="Hyperlink"/>
+        </w:rPr>
+        <w:t>http://www.thefountainguys.com/underwater-lights.htm</w:t>
+      </w:r>
+      <w:r>
+        <w:fldChar w:fldCharType="end"/>
+      </w:r>
+    </w:p>
+    <w:p>
+      <w:pPr>
+        <w:rPr>
+          <w:sz w:val="28"/>
+          <w:szCs w:val="28"/>
+        </w:rPr>
+      </w:pPr>
+      <w:hyperlink r:id="rId5" w:history="1">
+        <w:r>
+          <w:rPr>
+            <w:rStyle w:val="Hyperlink"/>
+          </w:rPr>
+          <w:t>http://webshop.nettbaat.no/categories/-undervannslys</w:t>
+        </w:r>
+      </w:hyperlink>
+      <w:bookmarkStart w:id="0" w:name="_GoBack"/>
+      <w:bookmarkEnd w:id="0"/>
+    </w:p>
+    <w:p>
       <w:pPr>
         <w:rPr>
           <w:sz w:val="28"/>
@@ -26,8 +64,6 @@
           <w:u w:val="single"/>
         </w:rPr>
       </w:pPr>
-      <w:bookmarkStart w:id="0" w:name="_GoBack"/>
-      <w:bookmarkEnd w:id="0"/>
       <w:r>
         <w:rPr>
           <w:b/>
@@ -49,7 +85,7 @@
           <w:lang w:val="en-US"/>
         </w:rPr>
       </w:pPr>
-      <w:hyperlink r:id="rId5" w:history="1">
+      <w:hyperlink r:id="rId6" w:history="1">
         <w:r>
           <w:rPr>
             <w:rStyle w:val="Hyperlink"/>
@@ -107,7 +143,7 @@
           <w:lang w:val="en-US"/>
         </w:rPr>
       </w:pPr>
-      <w:hyperlink r:id="rId6" w:history="1">
+      <w:hyperlink r:id="rId7" w:history="1">
         <w:r>
           <w:rPr>
             <w:rStyle w:val="Hyperlink"/>
@@ -124,6 +160,7 @@
           <w:sz w:val="36"/>
           <w:szCs w:val="36"/>
           <w:u w:val="single"/>
+          <w:lang w:val="en-US"/>
         </w:rPr>
       </w:pPr>
       <w:r>
@@ -132,21 +169,45 @@
           <w:sz w:val="36"/>
           <w:szCs w:val="36"/>
           <w:u w:val="single"/>
+          <w:lang w:val="en-US"/>
         </w:rPr>
         <w:t>150W HAL:</w:t>
       </w:r>
     </w:p>
     <w:p>
-      <w:hyperlink r:id="rId7" w:history="1">
+      <w:pPr>
+        <w:rPr>
+          <w:lang w:val="en-US"/>
+        </w:rPr>
+      </w:pPr>
+      <w:hyperlink r:id="rId8" w:history="1">
         <w:r>
           <w:rPr>
             <w:rStyle w:val="Hyperlink"/>
+            <w:lang w:val="en-US"/>
           </w:rPr>
           <w:t>http://no.rs-online.com/web/p/lampholders/0171023/</w:t>
         </w:r>
       </w:hyperlink>
       <w:r>
-        <w:t xml:space="preserve">  Lampeholder RS7 150W</w:t>
+        <w:rPr>
+          <w:lang w:val="en-US"/>
+        </w:rPr>
+        <w:t xml:space="preserve">  </w:t>
+      </w:r>
+      <w:proofErr w:type="spellStart"/>
+      <w:r>
+        <w:rPr>
+          <w:lang w:val="en-US"/>
+        </w:rPr>
+        <w:t>Lampeholder</w:t>
+      </w:r>
+      <w:proofErr w:type="spellEnd"/>
+      <w:r>
+        <w:rPr>
+          <w:lang w:val="en-US"/>
+        </w:rPr>
+        <w:t xml:space="preserve"> RS7 150W</w:t>
       </w:r>
     </w:p>
     <w:p>
@@ -158,7 +219,7 @@
           <w:u w:val="single"/>
         </w:rPr>
       </w:pPr>
-      <w:hyperlink r:id="rId8" w:history="1">
+      <w:hyperlink r:id="rId9" w:history="1">
         <w:r>
           <w:rPr>
             <w:rStyle w:val="Hyperlink"/>
@@ -169,7 +230,7 @@
       <w:r>
         <w:t xml:space="preserve"> den med </w:t>
       </w:r>
-      <w:hyperlink r:id="rId9" w:history="1">
+      <w:hyperlink r:id="rId10" w:history="1">
         <w:r>
           <w:rPr>
             <w:rStyle w:val="Hyperlink"/>
@@ -198,6 +259,7 @@
           <w:sz w:val="36"/>
           <w:szCs w:val="36"/>
           <w:u w:val="single"/>
+          <w:lang w:val="en-US"/>
         </w:rPr>
       </w:pPr>
       <w:r>
@@ -206,35 +268,54 @@
           <w:sz w:val="36"/>
           <w:szCs w:val="36"/>
           <w:u w:val="single"/>
+          <w:lang w:val="en-US"/>
         </w:rPr>
         <w:t>130W LED:</w:t>
       </w:r>
     </w:p>
     <w:p>
-      <w:hyperlink r:id="rId10" w:history="1">
+      <w:pPr>
+        <w:rPr>
+          <w:lang w:val="en-US"/>
+        </w:rPr>
+      </w:pPr>
+      <w:hyperlink r:id="rId11" w:history="1">
         <w:r>
           <w:rPr>
             <w:rStyle w:val="Hyperlink"/>
+            <w:lang w:val="en-US"/>
           </w:rPr>
           <w:t>http://www.alibaba.com/product-gs/710043572/LED_130w_factory_light_retrofit_kits.html?s=p</w:t>
         </w:r>
       </w:hyperlink>
     </w:p>
     <w:p>
-      <w:hyperlink r:id="rId11" w:history="1">
+      <w:pPr>
+        <w:rPr>
+          <w:lang w:val="en-US"/>
+        </w:rPr>
+      </w:pPr>
+      <w:hyperlink r:id="rId12" w:history="1">
         <w:r>
           <w:rPr>
             <w:rStyle w:val="Hyperlink"/>
+            <w:lang w:val="en-US"/>
           </w:rPr>
           <w:t>http://www.s-tech.com.au/products/led-high-bay-lights</w:t>
         </w:r>
       </w:hyperlink>
     </w:p>
     <w:p>
-      <w:hyperlink r:id="rId12" w:history="1">
+      <w:pPr>
+        <w:rPr>
+          <w:lang w:val="en-US"/>
+        </w:rPr>
+      </w:pPr>
+      <w:hyperlink r:id="rId13" w:history="1">
         <w:r>
           <w:rPr>
             <w:rStyle w:val="Hyperlink"/>
+            <w:lang w:val="en-US"/>
           </w:rPr>
           <w:t>http://www.nitto-opto.com/details.asp?prod_id=4550&amp;brandid=&amp;catid=C02&amp;subcat=&amp;keyword=&amp;page=</w:t>
         </w:r>
@@ -449,6 +530,18 @@
       <w:u w:val="single"/>
     </w:rPr>
   </w:style>
+  <w:style w:type="character" w:styleId="FollowedHyperlink">
+    <w:name w:val="FollowedHyperlink"/>
+    <w:basedOn w:val="DefaultParagraphFont"/>
+    <w:uiPriority w:val="99"/>
+    <w:semiHidden/>
+    <w:unhideWhenUsed/>
+    <w:rsid w:val="006C6E9F"/>
+    <w:rPr>
+      <w:color w:val="800080" w:themeColor="followedHyperlink"/>
+      <w:u w:val="single"/>
+    </w:rPr>
+  </w:style>
 </w:styles>
 </file>
 
@@ -648,6 +741,18 @@
     <w:rsid w:val="00BE0EF3"/>
     <w:rPr>
       <w:color w:val="0000FF"/>
+      <w:u w:val="single"/>
+    </w:rPr>
+  </w:style>
+  <w:style w:type="character" w:styleId="FollowedHyperlink">
+    <w:name w:val="FollowedHyperlink"/>
+    <w:basedOn w:val="DefaultParagraphFont"/>
+    <w:uiPriority w:val="99"/>
+    <w:semiHidden/>
+    <w:unhideWhenUsed/>
+    <w:rsid w:val="006C6E9F"/>
+    <w:rPr>
+      <w:color w:val="800080" w:themeColor="followedHyperlink"/>
       <w:u w:val="single"/>
     </w:rPr>
   </w:style>

</xml_diff>